<commit_message>
docs: clarify production AI provider and evaluation
Co-authored-by: Copilot <223556219+Copilot@users.noreply.github.com>
</commit_message>
<xml_diff>
--- a/MYC_ATS_Technical_Architecture.docx
+++ b/MYC_ATS_Technical_Architecture.docx
@@ -82,32 +82,10 @@
             </w:tcMar>
           </w:tcPr>
           <w:p>
-            <w:pPr>
-              <w:spacing w:after="40"/>
-              <w:jc w:val="center"/>
-            </w:pPr>
-            <w:r>
-              <w:rPr>
-                <w:b/>
-                <w:bCs/>
-                <w:color w:val="2E75B6"/>
-                <w:sz w:val="30"/>
-                <w:szCs w:val="30"/>
-              </w:rPr>
-              <w:t xml:space="preserve">269</w:t>
-            </w:r>
-          </w:p>
-          <w:p>
-            <w:pPr>
-              <w:jc w:val="center"/>
-            </w:pPr>
-            <w:r>
-              <w:rPr>
-                <w:color w:val="6B7280"/>
-                <w:sz w:val="17"/>
-                <w:szCs w:val="17"/>
-              </w:rPr>
-              <w:t xml:space="preserve">Resumes Validated</w:t>
+            <w:r>
+              <w:t>269</w:t>
+              <w:br/>
+              <w:t>Resumes in prior validation set</w:t>
             </w:r>
           </w:p>
         </w:tc>
@@ -129,32 +107,10 @@
             </w:tcMar>
           </w:tcPr>
           <w:p>
-            <w:pPr>
-              <w:spacing w:after="40"/>
-              <w:jc w:val="center"/>
-            </w:pPr>
-            <w:r>
-              <w:rPr>
-                <w:b/>
-                <w:bCs/>
-                <w:color w:val="2E75B6"/>
-                <w:sz w:val="30"/>
-                <w:szCs w:val="30"/>
-              </w:rPr>
-              <w:t xml:space="preserve">+18 pts</w:t>
-            </w:r>
-          </w:p>
-          <w:p>
-            <w:pPr>
-              <w:jc w:val="center"/>
-            </w:pPr>
-            <w:r>
-              <w:rPr>
-                <w:color w:val="6B7280"/>
-                <w:sz w:val="17"/>
-                <w:szCs w:val="17"/>
-              </w:rPr>
-              <w:t xml:space="preserve">Avg ATS Improvement</w:t>
+            <w:r>
+              <w:t>7</w:t>
+              <w:br/>
+              <w:t>Current pipeline stages</w:t>
             </w:r>
           </w:p>
         </w:tc>
@@ -176,32 +132,10 @@
             </w:tcMar>
           </w:tcPr>
           <w:p>
-            <w:pPr>
-              <w:spacing w:after="40"/>
-              <w:jc w:val="center"/>
-            </w:pPr>
-            <w:r>
-              <w:rPr>
-                <w:b/>
-                <w:bCs/>
-                <w:color w:val="2E75B6"/>
-                <w:sz w:val="30"/>
-                <w:szCs w:val="30"/>
-              </w:rPr>
-              <w:t xml:space="preserve">6</w:t>
-            </w:r>
-          </w:p>
-          <w:p>
-            <w:pPr>
-              <w:jc w:val="center"/>
-            </w:pPr>
-            <w:r>
-              <w:rPr>
-                <w:color w:val="6B7280"/>
-                <w:sz w:val="17"/>
-                <w:szCs w:val="17"/>
-              </w:rPr>
-              <w:t xml:space="preserve">Pipeline Stages</w:t>
+            <w:r>
+              <w:t>2</w:t>
+              <w:br/>
+              <w:t>Scoring layers: generic + optional maritime</w:t>
             </w:r>
           </w:p>
         </w:tc>
@@ -223,32 +157,10 @@
             </w:tcMar>
           </w:tcPr>
           <w:p>
-            <w:pPr>
-              <w:spacing w:after="40"/>
-              <w:jc w:val="center"/>
-            </w:pPr>
-            <w:r>
-              <w:rPr>
-                <w:b/>
-                <w:bCs/>
-                <w:color w:val="2E75B6"/>
-                <w:sz w:val="30"/>
-                <w:szCs w:val="30"/>
-              </w:rPr>
-              <w:t xml:space="preserve">16</w:t>
-            </w:r>
-          </w:p>
-          <w:p>
-            <w:pPr>
-              <w:jc w:val="center"/>
-            </w:pPr>
-            <w:r>
-              <w:rPr>
-                <w:color w:val="6B7280"/>
-                <w:sz w:val="17"/>
-                <w:szCs w:val="17"/>
-              </w:rPr>
-              <w:t xml:space="preserve">Maritime Ranks Covered</w:t>
+            <w:r>
+              <w:t>1</w:t>
+              <w:br/>
+              <w:t>Production LLM provider: Anthropic Claude</w:t>
             </w:r>
           </w:p>
         </w:tc>
@@ -297,7 +209,7 @@
         <w:spacing w:after="140"/>
       </w:pPr>
       <w:r>
-        <w:t xml:space="preserve">The system ingests a raw resume PDF, scores it against both general ATS rules and maritime-specific domain rules, rewrites it using an LLM, and outputs a clean, ATS-compliant DOCX — with a measurable before/after score.</w:t>
+        <w:t>The system ingests a resume PDF or DOCX, always runs generic ATS scoring, adds the maritime overlay when applicable, and can rewrite with Anthropic Claude. It generates ATS-compliant DOCX/PDF output and reports before/after scores when a rewrite runs.</w:t>
       </w:r>
     </w:p>
     <w:p>
@@ -317,7 +229,7 @@
         <w:spacing w:after="140"/>
       </w:pPr>
       <w:r>
-        <w:t xml:space="preserve">Six sequential stages, each independently testable. Five are pure deterministic code; one stage uses an LLM.</w:t>
+        <w:t>Seven pipeline stages: extraction, parsing, generic ATS scoring, optional maritime scoring, AI rewrite, document generation, and re-scoring. Only the AI rewrite is non-deterministic.</w:t>
       </w:r>
     </w:p>
     <w:tbl>
@@ -479,11 +391,7 @@
           </w:tcPr>
           <w:p>
             <w:r>
-              <w:rPr>
-                <w:sz w:val="19"/>
-                <w:szCs w:val="19"/>
-              </w:rPr>
-              <w:t xml:space="preserve">1</w:t>
+              <w:t>1</w:t>
             </w:r>
           </w:p>
         </w:tc>
@@ -505,13 +413,7 @@
           </w:tcPr>
           <w:p>
             <w:r>
-              <w:rPr>
-                <w:b/>
-                <w:bCs/>
-                <w:sz w:val="19"/>
-                <w:szCs w:val="19"/>
-              </w:rPr>
-              <w:t xml:space="preserve">Extract</w:t>
+              <w:t>Extract</w:t>
             </w:r>
           </w:p>
         </w:tc>
@@ -533,11 +435,7 @@
           </w:tcPr>
           <w:p>
             <w:r>
-              <w:rPr>
-                <w:sz w:val="19"/>
-                <w:szCs w:val="19"/>
-              </w:rPr>
-              <w:t xml:space="preserve">Reads PDF/DOCX, detects two-column layouts, reconstructs reading order using word x/y coordinates</w:t>
+              <w:t>Reads PDF/DOCX, detects layout issues, reconstructs reading order, and flags structural ATS violations.</w:t>
             </w:r>
           </w:p>
         </w:tc>
@@ -559,11 +457,7 @@
           </w:tcPr>
           <w:p>
             <w:r>
-              <w:rPr>
-                <w:sz w:val="19"/>
-                <w:szCs w:val="19"/>
-              </w:rPr>
-              <w:t xml:space="preserve">pdfplumber, python-docx</w:t>
+              <w:t>pdfplumber, python-docx</w:t>
             </w:r>
           </w:p>
         </w:tc>
@@ -587,11 +481,7 @@
           </w:tcPr>
           <w:p>
             <w:r>
-              <w:rPr>
-                <w:sz w:val="19"/>
-                <w:szCs w:val="19"/>
-              </w:rPr>
-              <w:t xml:space="preserve">2</w:t>
+              <w:t>2</w:t>
             </w:r>
           </w:p>
         </w:tc>
@@ -613,13 +503,7 @@
           </w:tcPr>
           <w:p>
             <w:r>
-              <w:rPr>
-                <w:b/>
-                <w:bCs/>
-                <w:sz w:val="19"/>
-                <w:szCs w:val="19"/>
-              </w:rPr>
-              <w:t xml:space="preserve">Parse</w:t>
+              <w:t>Parse</w:t>
             </w:r>
           </w:p>
         </w:tc>
@@ -641,11 +525,7 @@
           </w:tcPr>
           <w:p>
             <w:r>
-              <w:rPr>
-                <w:sz w:val="19"/>
-                <w:szCs w:val="19"/>
-              </w:rPr>
-              <w:t xml:space="preserve">Extracts name, contact, sections, skills, rank; pulls sea-service months from PDF service-record tables</w:t>
+              <w:t>Extracts candidate details, sections, skills, rank, certificates, and sea-service data.</w:t>
             </w:r>
           </w:p>
         </w:tc>
@@ -667,11 +547,7 @@
           </w:tcPr>
           <w:p>
             <w:r>
-              <w:rPr>
-                <w:sz w:val="19"/>
-                <w:szCs w:val="19"/>
-              </w:rPr>
-              <w:t xml:space="preserve">spaCy (en_core_web_lg), regex, dateutil</w:t>
+              <w:t>spaCy, regex, python-dateutil</w:t>
             </w:r>
           </w:p>
         </w:tc>
@@ -695,11 +571,7 @@
           </w:tcPr>
           <w:p>
             <w:r>
-              <w:rPr>
-                <w:sz w:val="19"/>
-                <w:szCs w:val="19"/>
-              </w:rPr>
-              <w:t xml:space="preserve">3</w:t>
+              <w:t>3</w:t>
             </w:r>
           </w:p>
         </w:tc>
@@ -721,13 +593,7 @@
           </w:tcPr>
           <w:p>
             <w:r>
-              <w:rPr>
-                <w:b/>
-                <w:bCs/>
-                <w:sz w:val="19"/>
-                <w:szCs w:val="19"/>
-              </w:rPr>
-              <w:t xml:space="preserve">Score</w:t>
+              <w:t>Generic ATS Score</w:t>
             </w:r>
           </w:p>
         </w:tc>
@@ -749,11 +615,7 @@
           </w:tcPr>
           <w:p>
             <w:r>
-              <w:rPr>
-                <w:sz w:val="19"/>
-                <w:szCs w:val="19"/>
-              </w:rPr>
-              <w:t xml:space="preserve">ATS score: format (40) + sections (20) + keywords (40), blended TF-IDF + coverage matching</w:t>
+              <w:t>Always-on /100 score: 40% parse/layout checks plus 60% content score.</w:t>
             </w:r>
           </w:p>
         </w:tc>
@@ -775,11 +637,7 @@
           </w:tcPr>
           <w:p>
             <w:r>
-              <w:rPr>
-                <w:sz w:val="19"/>
-                <w:szCs w:val="19"/>
-              </w:rPr>
-              <w:t xml:space="preserve">scikit-learn TF-IDF, cosine similarity</w:t>
+              <w:t>Deterministic rules</w:t>
             </w:r>
           </w:p>
         </w:tc>
@@ -803,11 +661,7 @@
           </w:tcPr>
           <w:p>
             <w:r>
-              <w:rPr>
-                <w:sz w:val="19"/>
-                <w:szCs w:val="19"/>
-              </w:rPr>
-              <w:t xml:space="preserve">4</w:t>
+              <w:t>4</w:t>
             </w:r>
           </w:p>
         </w:tc>
@@ -829,13 +683,7 @@
           </w:tcPr>
           <w:p>
             <w:r>
-              <w:rPr>
-                <w:b/>
-                <w:bCs/>
-                <w:sz w:val="19"/>
-                <w:szCs w:val="19"/>
-              </w:rPr>
-              <w:t xml:space="preserve">Maritime Score</w:t>
+              <w:t>Maritime Overlay</w:t>
             </w:r>
           </w:p>
         </w:tc>
@@ -857,11 +705,7 @@
           </w:tcPr>
           <w:p>
             <w:r>
-              <w:rPr>
-                <w:sz w:val="19"/>
-                <w:szCs w:val="19"/>
-              </w:rPr>
-              <w:t xml:space="preserve">Domain rules: cert requirements per rank, sea-service minimums, vessel-type match, bonus differentiation tier</w:t>
+              <w:t>Optional rank, certificate, sea-service, and vessel-type scoring.</w:t>
             </w:r>
           </w:p>
         </w:tc>
@@ -883,11 +727,7 @@
           </w:tcPr>
           <w:p>
             <w:r>
-              <w:rPr>
-                <w:sz w:val="19"/>
-                <w:szCs w:val="19"/>
-              </w:rPr>
-              <w:t xml:space="preserve">Custom rule engine</w:t>
+              <w:t>rules/cert_rules.py, rules/aliases.py</w:t>
             </w:r>
           </w:p>
         </w:tc>
@@ -911,11 +751,7 @@
           </w:tcPr>
           <w:p>
             <w:r>
-              <w:rPr>
-                <w:sz w:val="19"/>
-                <w:szCs w:val="19"/>
-              </w:rPr>
-              <w:t xml:space="preserve">5</w:t>
+              <w:t>5</w:t>
             </w:r>
           </w:p>
         </w:tc>
@@ -937,13 +773,7 @@
           </w:tcPr>
           <w:p>
             <w:r>
-              <w:rPr>
-                <w:b/>
-                <w:bCs/>
-                <w:sz w:val="19"/>
-                <w:szCs w:val="19"/>
-              </w:rPr>
-              <w:t xml:space="preserve">AI Rewrite</w:t>
+              <w:t>AI Rewrite</w:t>
             </w:r>
           </w:p>
         </w:tc>
@@ -965,11 +795,7 @@
           </w:tcPr>
           <w:p>
             <w:r>
-              <w:rPr>
-                <w:sz w:val="19"/>
-                <w:szCs w:val="19"/>
-              </w:rPr>
-              <w:t xml:space="preserve">LLM rewrites summary, bullets, skills, certs to ATS spec; raw-text fallback for garbled resumes; output validated, not trusted blindly</w:t>
+              <w:t>Optional Claude rewrite with source-grounding checks, fallback handling, and transient-error retries.</w:t>
             </w:r>
           </w:p>
         </w:tc>
@@ -991,11 +817,7 @@
           </w:tcPr>
           <w:p>
             <w:r>
-              <w:rPr>
-                <w:sz w:val="19"/>
-                <w:szCs w:val="19"/>
-              </w:rPr>
-              <w:t xml:space="preserve">Groq API (Llama 3.3 70B)</w:t>
+              <w:t>Anthropic Claude Messages API</w:t>
             </w:r>
           </w:p>
         </w:tc>
@@ -1019,11 +841,7 @@
           </w:tcPr>
           <w:p>
             <w:r>
-              <w:rPr>
-                <w:sz w:val="19"/>
-                <w:szCs w:val="19"/>
-              </w:rPr>
-              <w:t xml:space="preserve">6</w:t>
+              <w:t>6</w:t>
             </w:r>
           </w:p>
         </w:tc>
@@ -1045,13 +863,7 @@
           </w:tcPr>
           <w:p>
             <w:r>
-              <w:rPr>
-                <w:b/>
-                <w:bCs/>
-                <w:sz w:val="19"/>
-                <w:szCs w:val="19"/>
-              </w:rPr>
-              <w:t xml:space="preserve">Generate + Re-score</w:t>
+              <w:t>Generate</w:t>
             </w:r>
           </w:p>
         </w:tc>
@@ -1073,11 +885,7 @@
           </w:tcPr>
           <w:p>
             <w:r>
-              <w:rPr>
-                <w:sz w:val="19"/>
-                <w:szCs w:val="19"/>
-              </w:rPr>
-              <w:t xml:space="preserve">Builds clean single-column DOCX (Arial, no tables, no images), then re-runs the scorer to confirm improvement</w:t>
+              <w:t>Builds ATS-formatted DOCX and PDF outputs.</w:t>
             </w:r>
           </w:p>
         </w:tc>
@@ -1099,11 +907,49 @@
           </w:tcPr>
           <w:p>
             <w:r>
-              <w:rPr>
-                <w:sz w:val="19"/>
-                <w:szCs w:val="19"/>
-              </w:rPr>
-              <w:t xml:space="preserve">python-docx</w:t>
+              <w:t>python-docx, ReportLab</w:t>
+            </w:r>
+          </w:p>
+        </w:tc>
+      </w:tr>
+      <w:tr>
+        <w:tc>
+          <w:tcPr>
+            <w:tcW w:type="dxa" w:w="700"/>
+          </w:tcPr>
+          <w:p>
+            <w:r>
+              <w:t>7</w:t>
+            </w:r>
+          </w:p>
+        </w:tc>
+        <w:tc>
+          <w:tcPr>
+            <w:tcW w:type="dxa" w:w="1900"/>
+          </w:tcPr>
+          <w:p>
+            <w:r>
+              <w:t>Re-score</w:t>
+            </w:r>
+          </w:p>
+        </w:tc>
+        <w:tc>
+          <w:tcPr>
+            <w:tcW w:type="dxa" w:w="3960"/>
+          </w:tcPr>
+          <w:p>
+            <w:r>
+              <w:t>Re-runs the same scoring layers that were enabled before rewriting.</w:t>
+            </w:r>
+          </w:p>
+        </w:tc>
+        <w:tc>
+          <w:tcPr>
+            <w:tcW w:type="dxa" w:w="2800"/>
+          </w:tcPr>
+          <w:p>
+            <w:r>
+              <w:t>generic_ats/layer.py, pipeline/maritime.py</w:t>
             </w:r>
           </w:p>
         </w:tc>
@@ -1119,7 +965,7 @@
         <w:spacing w:after="140"/>
       </w:pPr>
       <w:r>
-        <w:t xml:space="preserve">Only Stage 5 is non-deterministic. Everything else is pure rules and math — which makes the score explainable: every point gained or lost traces to a named rule (R1–R42), not a black box.</w:t>
+        <w:t>Scoring is deterministic and based on explicit checks and rules. Legacy [R1]–[R42] labels apply only to the old scorer and regression tooling; they do not describe the current generic ATS rubric.</w:t>
       </w:r>
     </w:p>
     <w:p>
@@ -1271,11 +1117,7 @@
           </w:tcPr>
           <w:p>
             <w:r>
-              <w:rPr>
-                <w:sz w:val="19"/>
-                <w:szCs w:val="19"/>
-              </w:rPr>
-              <w:t xml:space="preserve">PDF extraction</w:t>
+              <w:t>PDF/DOCX extraction</w:t>
             </w:r>
           </w:p>
         </w:tc>
@@ -1297,11 +1139,7 @@
           </w:tcPr>
           <w:p>
             <w:r>
-              <w:rPr>
-                <w:sz w:val="19"/>
-                <w:szCs w:val="19"/>
-              </w:rPr>
-              <w:t xml:space="preserve">pdfplumber</w:t>
+              <w:t>pdfplumber, python-docx</w:t>
             </w:r>
           </w:p>
         </w:tc>
@@ -1323,11 +1161,7 @@
           </w:tcPr>
           <w:p>
             <w:r>
-              <w:rPr>
-                <w:sz w:val="19"/>
-                <w:szCs w:val="19"/>
-              </w:rPr>
-              <w:t xml:space="preserve">Word-level x/y coordinates enable column reconstruction that raw text extraction can't</w:t>
+              <w:t>Text and layout extraction for supported resume formats.</w:t>
             </w:r>
           </w:p>
         </w:tc>
@@ -1351,11 +1185,7 @@
           </w:tcPr>
           <w:p>
             <w:r>
-              <w:rPr>
-                <w:sz w:val="19"/>
-                <w:szCs w:val="19"/>
-              </w:rPr>
-              <w:t xml:space="preserve">NLP / NER</w:t>
+              <w:t>NLP / parsing</w:t>
             </w:r>
           </w:p>
         </w:tc>
@@ -1377,11 +1207,7 @@
           </w:tcPr>
           <w:p>
             <w:r>
-              <w:rPr>
-                <w:sz w:val="19"/>
-                <w:szCs w:val="19"/>
-              </w:rPr>
-              <w:t xml:space="preserve">spaCy en_core_web_lg</w:t>
+              <w:t>spaCy en_core_web_lg + rules</w:t>
             </w:r>
           </w:p>
         </w:tc>
@@ -1403,11 +1229,7 @@
           </w:tcPr>
           <w:p>
             <w:r>
-              <w:rPr>
-                <w:sz w:val="19"/>
-                <w:szCs w:val="19"/>
-              </w:rPr>
-              <w:t xml:space="preserve">Pre-trained entity recognition for names; combined with maritime-specific regex for ranks/certs</w:t>
+              <w:t>Name/entity support with maritime-specific regex and rule tables.</w:t>
             </w:r>
           </w:p>
         </w:tc>
@@ -1431,11 +1253,7 @@
           </w:tcPr>
           <w:p>
             <w:r>
-              <w:rPr>
-                <w:sz w:val="19"/>
-                <w:szCs w:val="19"/>
-              </w:rPr>
-              <w:t xml:space="preserve">Keyword matching</w:t>
+              <w:t>Generic ATS scoring</w:t>
             </w:r>
           </w:p>
         </w:tc>
@@ -1457,11 +1275,7 @@
           </w:tcPr>
           <w:p>
             <w:r>
-              <w:rPr>
-                <w:sz w:val="19"/>
-                <w:szCs w:val="19"/>
-              </w:rPr>
-              <w:t xml:space="preserve">scikit-learn TF-IDF</w:t>
+              <w:t>Deterministic ATS layer</w:t>
             </w:r>
           </w:p>
         </w:tc>
@@ -1483,11 +1297,7 @@
           </w:tcPr>
           <w:p>
             <w:r>
-              <w:rPr>
-                <w:sz w:val="19"/>
-                <w:szCs w:val="19"/>
-              </w:rPr>
-              <w:t xml:space="preserve">Blended with raw keyword coverage — cosine similarity alone under-scores short JDs against long resumes</w:t>
+              <w:t>40/60 parse-layout and content composition; whole-term keyword matching.</w:t>
             </w:r>
           </w:p>
         </w:tc>
@@ -1511,11 +1321,7 @@
           </w:tcPr>
           <w:p>
             <w:r>
-              <w:rPr>
-                <w:sz w:val="19"/>
-                <w:szCs w:val="19"/>
-              </w:rPr>
-              <w:t xml:space="preserve">AI rewriting</w:t>
+              <w:t>Maritime scoring</w:t>
             </w:r>
           </w:p>
         </w:tc>
@@ -1537,11 +1343,7 @@
           </w:tcPr>
           <w:p>
             <w:r>
-              <w:rPr>
-                <w:sz w:val="19"/>
-                <w:szCs w:val="19"/>
-              </w:rPr>
-              <w:t xml:space="preserve">Groq API</w:t>
+              <w:t>Custom rule tables</w:t>
             </w:r>
           </w:p>
         </w:tc>
@@ -1563,11 +1365,7 @@
           </w:tcPr>
           <w:p>
             <w:r>
-              <w:rPr>
-                <w:sz w:val="19"/>
-                <w:szCs w:val="19"/>
-              </w:rPr>
-              <w:t xml:space="preserve">Free-tier Llama 3.3 70B; fast inference; JSON-mode-style system prompting</w:t>
+              <w:t>Optional maritime overlay; no maritime score for generic resumes.</w:t>
             </w:r>
           </w:p>
         </w:tc>
@@ -1591,11 +1389,7 @@
           </w:tcPr>
           <w:p>
             <w:r>
-              <w:rPr>
-                <w:sz w:val="19"/>
-                <w:szCs w:val="19"/>
-              </w:rPr>
-              <w:t xml:space="preserve">Document generation</w:t>
+              <w:t>AI rewriting</w:t>
             </w:r>
           </w:p>
         </w:tc>
@@ -1617,11 +1411,7 @@
           </w:tcPr>
           <w:p>
             <w:r>
-              <w:rPr>
-                <w:sz w:val="19"/>
-                <w:szCs w:val="19"/>
-              </w:rPr>
-              <w:t xml:space="preserve">python-docx</w:t>
+              <w:t>Anthropic Claude (claude-haiku-5-5)</w:t>
             </w:r>
           </w:p>
         </w:tc>
@@ -1643,11 +1433,39 @@
           </w:tcPr>
           <w:p>
             <w:r>
-              <w:rPr>
-                <w:sz w:val="19"/>
-                <w:szCs w:val="19"/>
-              </w:rPr>
-              <w:t xml:space="preserve">Full control over ATS-compliant structure — no tables, no columns, no text boxes</w:t>
+              <w:t>Production rewrite provider; no Ollama or Groq integration in the live service.</w:t>
+            </w:r>
+          </w:p>
+        </w:tc>
+      </w:tr>
+      <w:tr>
+        <w:tc>
+          <w:tcPr>
+            <w:tcW w:type="dxa" w:w="2400"/>
+          </w:tcPr>
+          <w:p>
+            <w:r>
+              <w:t>Document generation</w:t>
+            </w:r>
+          </w:p>
+        </w:tc>
+        <w:tc>
+          <w:tcPr>
+            <w:tcW w:type="dxa" w:w="2200"/>
+          </w:tcPr>
+          <w:p>
+            <w:r>
+              <w:t>python-docx, ReportLab</w:t>
+            </w:r>
+          </w:p>
+        </w:tc>
+        <w:tc>
+          <w:tcPr>
+            <w:tcW w:type="dxa" w:w="4760"/>
+          </w:tcPr>
+          <w:p>
+            <w:r>
+              <w:t>ATS-compliant DOCX and single-column PDF outputs.</w:t>
             </w:r>
           </w:p>
         </w:tc>
@@ -1795,11 +1613,7 @@
           </w:tcPr>
           <w:p>
             <w:r>
-              <w:rPr>
-                <w:sz w:val="19"/>
-                <w:szCs w:val="19"/>
-              </w:rPr>
-              <w:t xml:space="preserve">API framework</w:t>
+              <w:t>API framework</w:t>
             </w:r>
           </w:p>
         </w:tc>
@@ -1821,11 +1635,7 @@
           </w:tcPr>
           <w:p>
             <w:r>
-              <w:rPr>
-                <w:sz w:val="19"/>
-                <w:szCs w:val="19"/>
-              </w:rPr>
-              <w:t xml:space="preserve">FastAPI</w:t>
+              <w:t>FastAPI</w:t>
             </w:r>
           </w:p>
         </w:tc>
@@ -1847,11 +1657,7 @@
           </w:tcPr>
           <w:p>
             <w:r>
-              <w:rPr>
-                <w:sz w:val="19"/>
-                <w:szCs w:val="19"/>
-              </w:rPr>
-              <w:t xml:space="preserve">Async, auto-docs, native background task support for long-running pipeline jobs</w:t>
+              <w:t>REST API with synchronous scoring and in-process background rewrite jobs.</w:t>
             </w:r>
           </w:p>
         </w:tc>
@@ -1875,11 +1681,7 @@
           </w:tcPr>
           <w:p>
             <w:r>
-              <w:rPr>
-                <w:sz w:val="19"/>
-                <w:szCs w:val="19"/>
-              </w:rPr>
-              <w:t xml:space="preserve">Job queue</w:t>
+              <w:t>Job execution</w:t>
             </w:r>
           </w:p>
         </w:tc>
@@ -1901,11 +1703,7 @@
           </w:tcPr>
           <w:p>
             <w:r>
-              <w:rPr>
-                <w:sz w:val="19"/>
-                <w:szCs w:val="19"/>
-              </w:rPr>
-              <w:t xml:space="preserve">BackgroundTasks</w:t>
+              <w:t>BackgroundTasks</w:t>
             </w:r>
           </w:p>
         </w:tc>
@@ -1927,11 +1725,7 @@
           </w:tcPr>
           <w:p>
             <w:r>
-              <w:rPr>
-                <w:sz w:val="19"/>
-                <w:szCs w:val="19"/>
-              </w:rPr>
-              <w:t xml:space="preserve">Sufficient at current scale; designed to swap for Celery + Redis without API changes</w:t>
+              <w:t>In-process execution; not a durable queue. Celery/Redis remain deferred until a real load trigger.</w:t>
             </w:r>
           </w:p>
         </w:tc>
@@ -1955,11 +1749,7 @@
           </w:tcPr>
           <w:p>
             <w:r>
-              <w:rPr>
-                <w:sz w:val="19"/>
-                <w:szCs w:val="19"/>
-              </w:rPr>
-              <w:t xml:space="preserve">Database</w:t>
+              <w:t>Database</w:t>
             </w:r>
           </w:p>
         </w:tc>
@@ -1981,11 +1771,7 @@
           </w:tcPr>
           <w:p>
             <w:r>
-              <w:rPr>
-                <w:sz w:val="19"/>
-                <w:szCs w:val="19"/>
-              </w:rPr>
-              <w:t xml:space="preserve">SQLite (WAL mode)</w:t>
+              <w:t>SQLite (WAL mode)</w:t>
             </w:r>
           </w:p>
         </w:tc>
@@ -2007,11 +1793,7 @@
           </w:tcPr>
           <w:p>
             <w:r>
-              <w:rPr>
-                <w:sz w:val="19"/>
-                <w:szCs w:val="19"/>
-              </w:rPr>
-              <w:t xml:space="preserve">Zero-ops persistence for job state; WAL mode enables concurrent reads during writes</w:t>
+              <w:t>Persistent job state and cross-worker concurrency checks.</w:t>
             </w:r>
           </w:p>
         </w:tc>
@@ -2035,11 +1817,7 @@
           </w:tcPr>
           <w:p>
             <w:r>
-              <w:rPr>
-                <w:sz w:val="19"/>
-                <w:szCs w:val="19"/>
-              </w:rPr>
-              <w:t xml:space="preserve">Auth</w:t>
+              <w:t>Authentication</w:t>
             </w:r>
           </w:p>
         </w:tc>
@@ -2061,11 +1839,7 @@
           </w:tcPr>
           <w:p>
             <w:r>
-              <w:rPr>
-                <w:sz w:val="19"/>
-                <w:szCs w:val="19"/>
-              </w:rPr>
-              <w:t xml:space="preserve">API key header</w:t>
+              <w:t>API key headers</w:t>
             </w:r>
           </w:p>
         </w:tc>
@@ -2087,11 +1861,7 @@
           </w:tcPr>
           <w:p>
             <w:r>
-              <w:rPr>
-                <w:sz w:val="19"/>
-                <w:szCs w:val="19"/>
-              </w:rPr>
-              <w:t xml:space="preserve">Simple shared-secret auth appropriate for a single trusted client (MYC's app backend)</w:t>
+              <w:t>Separate client and admin credentials; production requires distinct keys.</w:t>
             </w:r>
           </w:p>
         </w:tc>
@@ -2115,11 +1885,7 @@
           </w:tcPr>
           <w:p>
             <w:r>
-              <w:rPr>
-                <w:sz w:val="19"/>
-                <w:szCs w:val="19"/>
-              </w:rPr>
-              <w:t xml:space="preserve">Server</w:t>
+              <w:t>Server</w:t>
             </w:r>
           </w:p>
         </w:tc>
@@ -2141,11 +1907,7 @@
           </w:tcPr>
           <w:p>
             <w:r>
-              <w:rPr>
-                <w:sz w:val="19"/>
-                <w:szCs w:val="19"/>
-              </w:rPr>
-              <w:t xml:space="preserve">Uvicorn (2 workers)</w:t>
+              <w:t>Uvicorn (2 workers)</w:t>
             </w:r>
           </w:p>
         </w:tc>
@@ -2167,11 +1929,7 @@
           </w:tcPr>
           <w:p>
             <w:r>
-              <w:rPr>
-                <w:sz w:val="19"/>
-                <w:szCs w:val="19"/>
-              </w:rPr>
-              <w:t xml:space="preserve">ASGI server; worker count matched to SQLite WAL's safe concurrency ceiling</w:t>
+              <w:t>Production binds to loopback behind a separately configured TLS proxy.</w:t>
             </w:r>
           </w:p>
         </w:tc>
@@ -2194,7 +1952,7 @@
         <w:spacing w:after="140"/>
       </w:pPr>
       <w:r>
-        <w:t xml:space="preserve">Two independent scorers run in parallel on every resume.</w:t>
+        <w:t>The generic ATS score always runs. The maritime overlay is optional and activates for a detected seafarer rank or explicit maritime target fields.</w:t>
       </w:r>
     </w:p>
     <w:p>
@@ -2216,7 +1974,7 @@
         <w:spacing w:after="60"/>
       </w:pPr>
       <w:r>
-        <w:t xml:space="preserve">Format (40 pts): single-column layout, no tables/images, fonts, contact parseability, no special characters, active voice, quantified achievements</w:t>
+        <w:t>Parse/layout checks (40%): text extraction, garbling, columns, tables, images, contact information, section headings, and dates.</w:t>
       </w:r>
     </w:p>
     <w:p>
@@ -2229,7 +1987,7 @@
         <w:spacing w:after="60"/>
       </w:pPr>
       <w:r>
-        <w:t xml:space="preserve">Sections (20 pts): presence and quality of Summary, Experience, Education, Skills, Certifications — detected from both parsed structure and raw text (handles generated-DOCX re-scoring)</w:t>
+        <w:t>Content score (60%): keyword match (40%), skills coverage (20%), title match (15%), section completeness (15%), and date consistency (10%).</w:t>
       </w:r>
     </w:p>
     <w:p>
@@ -2242,7 +2000,7 @@
         <w:spacing w:after="60"/>
       </w:pPr>
       <w:r>
-        <w:t xml:space="preserve">Keywords (40 pts): blended score — 70% weight on raw JD-keyword coverage (filtered for stopwords), 30% weight on TF-IDF cosine similarity. Pure cosine under-scores short job descriptions against long resumes; pure keyword-count over-rewards stuffing</w:t>
+        <w:t>The content score has quality caps and short-resume adjustments; scores are calibrated after the parse/layout and content components are composed. The generic layer uses deterministic whole-term keyword matching, not the legacy TF-IDF scorer.</w:t>
       </w:r>
     </w:p>
     <w:p>
@@ -2251,7 +2009,7 @@
         <w:spacing w:after="120" w:before="280"/>
       </w:pPr>
       <w:r>
-        <w:t xml:space="preserve">Maritime Score — /65 base + /20 bonus</w:t>
+        <w:t>Maritime overlay — optional, rule-based score</w:t>
       </w:r>
     </w:p>
     <w:p>
@@ -2264,7 +2022,7 @@
         <w:spacing w:after="60"/>
       </w:pPr>
       <w:r>
-        <w:t xml:space="preserve">Certificate coverage (25 pts): rank-specific requirement table — e.g. Third Officer needs CoC + STCW + ENG1, Chief Officer additionally needs GMDSS. Alias matching handles real-world phrasing variance (INDOS number and CDC number serve as ENG1 proxies, since Indian seafarers' resumes rarely state ENG1 explicitly but registration implies it)</w:t>
+        <w:t>Certificate checks use rank-specific requirements and aliases from rules/cert_rules.py and rules/aliases.py; the overlay also evaluates sea service, vessel types, and rank.</w:t>
       </w:r>
     </w:p>
     <w:p>
@@ -2277,7 +2035,7 @@
         <w:spacing w:after="60"/>
       </w:pPr>
       <w:r>
-        <w:t xml:space="preserve">Sea service (20 pts): extracted directly from the PDF's service-record table (sign-on/sign-off date pairs), not estimated from work-experience text — far more reliable on Canva templates</w:t>
+        <w:t>Sea service is extracted from PDF service-record tables, with a text-based date-range fallback for re-scoring generated DOCX files.</w:t>
       </w:r>
     </w:p>
     <w:p>
@@ -2290,7 +2048,7 @@
         <w:spacing w:after="60"/>
       </w:pPr>
       <w:r>
-        <w:t xml:space="preserve">Vessel type match (10 pts) and rank detection (10 pts)</w:t>
+        <w:t>The overlay is applied only when maritime scoring is enabled; generic resumes do not receive a maritime score.</w:t>
       </w:r>
     </w:p>
     <w:p>
@@ -2303,7 +2061,7 @@
         <w:spacing w:after="60"/>
       </w:pPr>
       <w:r>
-        <w:t xml:space="preserve">Bonus tier (0–20 pts): differentiates candidates who all hit the scoring ceiling — sea-service depth beyond minimum, vessel-type diversity, full cert coverage, senior-rank premium. Without this, ~45% of candidates clustered at the same maximum score with no way to rank them</w:t>
+        <w:t>Maritime rule values and thresholds are maintained in the rule tables; do not change them without validating against the resume regression set.</w:t>
       </w:r>
     </w:p>
     <w:p>
@@ -2349,7 +2107,7 @@
         <w:spacing w:after="140"/>
       </w:pPr>
       <w:r>
-        <w:t xml:space="preserve">Three safety layers around the Groq call: (1) a raw-text fallback triggers when parsed sections are too thin — common on heavily-garbled resumes — sending the LLM unprocessed text to reconstruct from; (2) post-generation validation checks for placeholder text, empty sections, and hallucinated entities not present in the source; (3) a deterministic minimum-quality patch pads skill lists and fixes certificate formatting without ever inventing facts.</w:t>
+        <w:t>The Anthropic Claude rewrite uses raw-text fallback for thin parses, validates required output fields, restores source-grounded protected signals, and applies deterministic completeness and writing-quality checks. Numeric-claim rejection is a narrow heuristic, not comprehensive fact verification.</w:t>
       </w:r>
     </w:p>
     <w:p>
@@ -2366,7 +2124,7 @@
         <w:spacing w:after="140"/>
       </w:pPr>
       <w:r>
-        <w:t xml:space="preserve">After the DOCX is generated, the full extraction and scoring pipeline runs again on the output. This is the only way to verify the rewrite actually improved the ATS score rather than trusting the LLM's self-reported "issues fixed" list.</w:t>
+        <w:t>After generation, the enabled scoring layers run again on the output. If the rewrite scores below the original generic ATS score, the pipeline falls back to source-derived content; that fallback is also rescored but is not guaranteed to match the uploaded file score.</w:t>
       </w:r>
     </w:p>
     <w:p>
@@ -2383,7 +2141,7 @@
         <w:spacing w:after="140"/>
       </w:pPr>
       <w:r>
-        <w:t xml:space="preserve">Early versions parsed work-experience bullet text for date ranges, producing wildly inaccurate totals (one candidate showed 277 months from misread passport/visa dates). The fix targets the PDF's actual "Seafarer's Service Record" table specifically — DD/MM/YYYY sign-on/sign-off pairs — with overlap deduplication for cadet-to-officer transitions on the same vessel.</w:t>
+        <w:t>PDF service-record tables are used for sea-service extraction when available. A text-based date-range fallback supports re-scoring generated DOCX files, which have no source PDF table to parse.</w:t>
       </w:r>
     </w:p>
     <w:p>
@@ -2403,7 +2161,7 @@
         <w:spacing w:after="140"/>
       </w:pPr>
       <w:r>
-        <w:t xml:space="preserve">269 real candidate resumes processed end-to-end, zero pipeline errors.</w:t>
+        <w:t>Validation results come from different scorer generations and must not be conflated. The legacy single-layer before/after results below are historical and do not measure the current two-layer generic scorer.</w:t>
       </w:r>
     </w:p>
     <w:tbl>
@@ -2443,14 +2201,7 @@
           </w:tcPr>
           <w:p>
             <w:r>
-              <w:rPr>
-                <w:b/>
-                <w:bCs/>
-                <w:color w:val="FFFFFF"/>
-                <w:sz w:val="19"/>
-                <w:szCs w:val="19"/>
-              </w:rPr>
-              <w:t xml:space="preserve">Metric</w:t>
+              <w:t>Measure</w:t>
             </w:r>
           </w:p>
         </w:tc>
@@ -2473,14 +2224,7 @@
           </w:tcPr>
           <w:p>
             <w:r>
-              <w:rPr>
-                <w:b/>
-                <w:bCs/>
-                <w:color w:val="FFFFFF"/>
-                <w:sz w:val="19"/>
-                <w:szCs w:val="19"/>
-              </w:rPr>
-              <w:t xml:space="preserve">Before</w:t>
+              <w:t>Prior result</w:t>
             </w:r>
           </w:p>
         </w:tc>
@@ -2503,14 +2247,7 @@
           </w:tcPr>
           <w:p>
             <w:r>
-              <w:rPr>
-                <w:b/>
-                <w:bCs/>
-                <w:color w:val="FFFFFF"/>
-                <w:sz w:val="19"/>
-                <w:szCs w:val="19"/>
-              </w:rPr>
-              <w:t xml:space="preserve">After Fixes</w:t>
+              <w:t>Context</w:t>
             </w:r>
           </w:p>
         </w:tc>
@@ -2534,11 +2271,7 @@
           </w:tcPr>
           <w:p>
             <w:r>
-              <w:rPr>
-                <w:sz w:val="19"/>
-                <w:szCs w:val="19"/>
-              </w:rPr>
-              <w:t xml:space="preserve">Avg ATS Score</w:t>
+              <w:t>Two-layer scores-only run</w:t>
             </w:r>
           </w:p>
         </w:tc>
@@ -2560,11 +2293,7 @@
           </w:tcPr>
           <w:p>
             <w:r>
-              <w:rPr>
-                <w:sz w:val="19"/>
-                <w:szCs w:val="19"/>
-              </w:rPr>
-              <w:t xml:space="preserve">63.4 / 100</w:t>
+              <w:t>269 scored; 0 errors</w:t>
             </w:r>
           </w:p>
         </w:tc>
@@ -2586,11 +2315,7 @@
           </w:tcPr>
           <w:p>
             <w:r>
-              <w:rPr>
-                <w:sz w:val="19"/>
-                <w:szCs w:val="19"/>
-              </w:rPr>
-              <w:t xml:space="preserve">69.1 / 100</w:t>
+              <w:t>Prior local run; not rerun after the PDF parser dependency update.</w:t>
             </w:r>
           </w:p>
         </w:tc>
@@ -2614,11 +2339,7 @@
           </w:tcPr>
           <w:p>
             <w:r>
-              <w:rPr>
-                <w:sz w:val="19"/>
-                <w:szCs w:val="19"/>
-              </w:rPr>
-              <w:t xml:space="preserve">Avg Maritime Score</w:t>
+              <w:t>Generic ATS</w:t>
             </w:r>
           </w:p>
         </w:tc>
@@ -2640,11 +2361,7 @@
           </w:tcPr>
           <w:p>
             <w:r>
-              <w:rPr>
-                <w:sz w:val="19"/>
-                <w:szCs w:val="19"/>
-              </w:rPr>
-              <w:t xml:space="preserve">54.1 / 65</w:t>
+              <w:t>Mean 57.0; median 58; range 24–75</w:t>
             </w:r>
           </w:p>
         </w:tc>
@@ -2666,11 +2383,7 @@
           </w:tcPr>
           <w:p>
             <w:r>
-              <w:rPr>
-                <w:sz w:val="19"/>
-                <w:szCs w:val="19"/>
-              </w:rPr>
-              <w:t xml:space="preserve">70.7 / 85</w:t>
+              <w:t>162 FAIL, 106 PASS, 1 GOOD; scores-only, not rewrite improvement.</w:t>
             </w:r>
           </w:p>
         </w:tc>
@@ -2694,11 +2407,7 @@
           </w:tcPr>
           <w:p>
             <w:r>
-              <w:rPr>
-                <w:sz w:val="19"/>
-                <w:szCs w:val="19"/>
-              </w:rPr>
-              <w:t xml:space="preserve">Resumes with 0 sea months detected</w:t>
+              <w:t>Maritime overlay</w:t>
             </w:r>
           </w:p>
         </w:tc>
@@ -2720,11 +2429,7 @@
           </w:tcPr>
           <w:p>
             <w:r>
-              <w:rPr>
-                <w:sz w:val="19"/>
-                <w:szCs w:val="19"/>
-              </w:rPr>
-              <w:t xml:space="preserve">56</w:t>
+              <w:t>254 scored; mean 76.0</w:t>
             </w:r>
           </w:p>
         </w:tc>
@@ -2746,11 +2451,7 @@
           </w:tcPr>
           <w:p>
             <w:r>
-              <w:rPr>
-                <w:sz w:val="19"/>
-                <w:szCs w:val="19"/>
-              </w:rPr>
-              <w:t xml:space="preserve">2</w:t>
+              <w:t>From the same prior scores-only run.</w:t>
             </w:r>
           </w:p>
         </w:tc>
@@ -2774,11 +2475,7 @@
           </w:tcPr>
           <w:p>
             <w:r>
-              <w:rPr>
-                <w:sz w:val="19"/>
-                <w:szCs w:val="19"/>
-              </w:rPr>
-              <w:t xml:space="preserve">ATS FAIL grade</w:t>
+              <w:t>Legacy single-layer rewrite batch</w:t>
             </w:r>
           </w:p>
         </w:tc>
@@ -2800,11 +2497,7 @@
           </w:tcPr>
           <w:p>
             <w:r>
-              <w:rPr>
-                <w:sz w:val="19"/>
-                <w:szCs w:val="19"/>
-              </w:rPr>
-              <w:t xml:space="preserve">82</w:t>
+              <w:t>ATS 63.4 → 69.1; maritime 54.1 → 70.7</w:t>
             </w:r>
           </w:p>
         </w:tc>
@@ -2826,11 +2519,7 @@
           </w:tcPr>
           <w:p>
             <w:r>
-              <w:rPr>
-                <w:sz w:val="19"/>
-                <w:szCs w:val="19"/>
-              </w:rPr>
-              <w:t xml:space="preserve">1</w:t>
+              <w:t>Historical results; do not attribute to the current two-layer scorer.</w:t>
             </w:r>
           </w:p>
         </w:tc>
@@ -2854,11 +2543,7 @@
           </w:tcPr>
           <w:p>
             <w:r>
-              <w:rPr>
-                <w:sz w:val="19"/>
-                <w:szCs w:val="19"/>
-              </w:rPr>
-              <w:t xml:space="preserve">Sample candidate (Third Engineer)</w:t>
+              <w:t>Legacy batch changes</w:t>
             </w:r>
           </w:p>
         </w:tc>
@@ -2880,11 +2565,7 @@
           </w:tcPr>
           <w:p>
             <w:r>
-              <w:rPr>
-                <w:sz w:val="19"/>
-                <w:szCs w:val="19"/>
-              </w:rPr>
-              <w:t xml:space="preserve">56 / 100</w:t>
+              <w:t>0 sea-month resumes: 56 → 2; ATS FAIL: 82 → 1</w:t>
             </w:r>
           </w:p>
         </w:tc>
@@ -2906,11 +2587,7 @@
           </w:tcPr>
           <w:p>
             <w:r>
-              <w:rPr>
-                <w:sz w:val="19"/>
-                <w:szCs w:val="19"/>
-              </w:rPr>
-              <w:t xml:space="preserve">85 / 100</w:t>
+              <w:t>Historical single-layer before/after figures only.</w:t>
             </w:r>
           </w:p>
         </w:tc>
@@ -2926,7 +2603,7 @@
         <w:spacing w:after="140"/>
       </w:pPr>
       <w:r>
-        <w:t xml:space="preserve">Individual end-to-end test (Aashutosh Krishna, Third Engineer): 56 → 85, FAIL to EXCELLENT, after fixing the column-reconstruction bug that was truncating company and vessel names.</w:t>
+        <w:t>A prior run of the then-current two-layer scorer processed 269 resumes in scores-only mode: 269 scored, 0 errors; generic ATS mean 57.0, median 58, range 24–75, with 162 FAIL, 106 PASS, and 1 GOOD; maritime scoring ran for 254 resumes with a mean of 76.0. This was not a rewrite-improvement run and was not repeated after the PDF parser dependency update.</w:t>
       </w:r>
     </w:p>
     <w:p>
@@ -3020,7 +2697,7 @@
         <w:spacing w:after="60"/>
       </w:pPr>
       <w:r>
-        <w:t xml:space="preserve">Disk-space and Groq-connectivity health checks for monitoring</w:t>
+        <w:t>Database and disk health checks are available at /health; authenticated /health/deep checks Anthropic Claude connectivity, database, and disk space.</w:t>
       </w:r>
     </w:p>
     <w:p>
@@ -3058,7 +2735,7 @@
         <w:spacing w:after="60"/>
       </w:pPr>
       <w:r>
-        <w:t xml:space="preserve">Custom spaCy NER model fine-tuned on the 5,000-resume corpus — replaces regex-based rank/cert/vessel extraction with a trained model for the long tail of phrasing variance</w:t>
+        <w:t>Consider a custom spaCy NER model only if a sufficiently large, validated labeled corpus exists and the current rules-based extraction demonstrably underperforms.</w:t>
       </w:r>
     </w:p>
     <w:p>

</xml_diff>